<commit_message>
Updated Notes and Agentic AI Scope Report Added
</commit_message>
<xml_diff>
--- a/Notes.docx
+++ b/Notes.docx
@@ -437,6 +437,98 @@
             <w:lang w:val="en-US"/>
           </w:rPr>
           <w:t>https://www.analyticsvidhya.com/blog/2025/03/gpt-4o-image-generation-prompts/</w:t>
+        </w:r>
+      </w:hyperlink>
+    </w:p>
+    <w:p>
+      <w:pPr>
+        <w:pStyle w:val="ListParagraph"/>
+        <w:numPr>
+          <w:ilvl w:val="0"/>
+          <w:numId w:val="1"/>
+        </w:numPr>
+        <w:rPr>
+          <w:rFonts w:ascii="Calibri" w:hAnsi="Calibri" w:cs="Calibri"/>
+          <w:sz w:val="28"/>
+          <w:szCs w:val="28"/>
+          <w:lang w:val="en-US"/>
+        </w:rPr>
+      </w:pPr>
+      <w:r>
+        <w:rPr>
+          <w:rFonts w:ascii="Calibri" w:hAnsi="Calibri" w:cs="Calibri"/>
+          <w:sz w:val="28"/>
+          <w:szCs w:val="28"/>
+          <w:lang w:val="en-US"/>
+        </w:rPr>
+        <w:t xml:space="preserve">RAGs – </w:t>
+      </w:r>
+      <w:proofErr w:type="spellStart"/>
+      <w:r>
+        <w:rPr>
+          <w:rFonts w:ascii="Calibri" w:hAnsi="Calibri" w:cs="Calibri"/>
+          <w:sz w:val="28"/>
+          <w:szCs w:val="28"/>
+          <w:lang w:val="en-US"/>
+        </w:rPr>
+        <w:t>NotebookLM</w:t>
+      </w:r>
+      <w:proofErr w:type="spellEnd"/>
+      <w:r>
+        <w:rPr>
+          <w:rFonts w:ascii="Calibri" w:hAnsi="Calibri" w:cs="Calibri"/>
+          <w:sz w:val="28"/>
+          <w:szCs w:val="28"/>
+          <w:lang w:val="en-US"/>
+        </w:rPr>
+        <w:t xml:space="preserve"> - </w:t>
+      </w:r>
+      <w:hyperlink r:id="rId14" w:history="1">
+        <w:r>
+          <w:rPr>
+            <w:rStyle w:val="Hyperlink"/>
+            <w:rFonts w:ascii="Calibri" w:hAnsi="Calibri" w:cs="Calibri"/>
+            <w:sz w:val="28"/>
+            <w:szCs w:val="28"/>
+            <w:lang w:val="en-US"/>
+          </w:rPr>
+          <w:t>https://notebooklm.google.com/notebook/</w:t>
+        </w:r>
+      </w:hyperlink>
+    </w:p>
+    <w:p>
+      <w:pPr>
+        <w:pStyle w:val="ListParagraph"/>
+        <w:numPr>
+          <w:ilvl w:val="0"/>
+          <w:numId w:val="1"/>
+        </w:numPr>
+        <w:rPr>
+          <w:rFonts w:ascii="Calibri" w:hAnsi="Calibri" w:cs="Calibri"/>
+          <w:sz w:val="28"/>
+          <w:szCs w:val="28"/>
+          <w:lang w:val="en-US"/>
+        </w:rPr>
+      </w:pPr>
+      <w:r>
+        <w:rPr>
+          <w:rFonts w:ascii="Calibri" w:hAnsi="Calibri" w:cs="Calibri"/>
+          <w:sz w:val="28"/>
+          <w:szCs w:val="28"/>
+          <w:lang w:val="en-US"/>
+        </w:rPr>
+        <w:t xml:space="preserve">Fine Tuning vs RAG - </w:t>
+      </w:r>
+      <w:hyperlink r:id="rId15" w:history="1">
+        <w:r>
+          <w:rPr>
+            <w:rStyle w:val="Hyperlink"/>
+            <w:rFonts w:ascii="Calibri" w:hAnsi="Calibri" w:cs="Calibri"/>
+            <w:sz w:val="28"/>
+            <w:szCs w:val="28"/>
+            <w:lang w:val="en-US"/>
+          </w:rPr>
+          <w:t>https://www.analyticsvidhya.com/blog/2024/05/fine-tuning-vs-rag/</w:t>
         </w:r>
       </w:hyperlink>
     </w:p>
@@ -1509,6 +1601,18 @@
       <w:shd w:val="clear" w:color="auto" w:fill="E1DFDD"/>
     </w:rPr>
   </w:style>
+  <w:style w:type="character" w:styleId="FollowedHyperlink">
+    <w:name w:val="FollowedHyperlink"/>
+    <w:basedOn w:val="DefaultParagraphFont"/>
+    <w:uiPriority w:val="99"/>
+    <w:semiHidden/>
+    <w:unhideWhenUsed/>
+    <w:rsid w:val="008623CF"/>
+    <w:rPr>
+      <w:color w:val="96607D" w:themeColor="followedHyperlink"/>
+      <w:u w:val="single"/>
+    </w:rPr>
+  </w:style>
 </w:styles>
 </file>
 

</xml_diff>